<commit_message>
Formatting in Compound verb file
</commit_message>
<xml_diff>
--- a/lower_intermediate_stuffs/compound_verbs/compound_verbs_list_example.docx
+++ b/lower_intermediate_stuffs/compound_verbs/compound_verbs_list_example.docx
@@ -4,8 +4,13 @@
   <w:body>
     <w:p>
       <w:pPr>
-        <w:pStyle w:val="Title"/>
+        <w:pStyle w:val="Heading1"/>
+        <w:numPr>
+          <w:ilvl w:val="0"/>
+          <w:numId w:val="1"/>
+        </w:numPr>
         <w:spacing w:before="240" w:after="120"/>
+        <w:ind w:hanging="0" w:start="0"/>
         <w:rPr/>
       </w:pPr>
       <w:r>
@@ -27,13 +32,17 @@
     </w:p>
     <w:p>
       <w:pPr>
-        <w:pStyle w:val="Normal"/>
-        <w:bidi w:val="0"/>
-        <w:jc w:val="start"/>
-        <w:rPr/>
-      </w:pPr>
-      <w:r>
-        <w:rPr/>
+        <w:pStyle w:val="Heading2"/>
+        <w:numPr>
+          <w:ilvl w:val="0"/>
+          <w:numId w:val="1"/>
+        </w:numPr>
+        <w:ind w:hanging="0" w:start="0"/>
+        <w:rPr/>
+      </w:pPr>
+      <w:r>
+        <w:rPr/>
+        <w:t>Groups</w:t>
       </w:r>
     </w:p>
     <w:p>
@@ -50,9 +59,7 @@
     </w:p>
     <w:p>
       <w:pPr>
-        <w:pStyle w:val="Normal"/>
-        <w:bidi w:val="0"/>
-        <w:jc w:val="start"/>
+        <w:pStyle w:val="BodyText"/>
         <w:rPr/>
       </w:pPr>
       <w:r>
@@ -222,20 +229,12 @@
     </w:p>
     <w:p>
       <w:pPr>
-        <w:pStyle w:val="Normal"/>
-        <w:bidi w:val="0"/>
-        <w:jc w:val="start"/>
-        <w:rPr/>
-      </w:pPr>
-      <w:r>
-        <w:rPr/>
-      </w:r>
-    </w:p>
-    <w:p>
-      <w:pPr>
-        <w:pStyle w:val="Normal"/>
-        <w:bidi w:val="0"/>
-        <w:jc w:val="start"/>
+        <w:pStyle w:val="Heading2"/>
+        <w:numPr>
+          <w:ilvl w:val="1"/>
+          <w:numId w:val="1"/>
+        </w:numPr>
+        <w:ind w:hanging="0" w:start="0"/>
         <w:rPr/>
       </w:pPr>
       <w:r>
@@ -245,9 +244,12 @@
     </w:p>
     <w:p>
       <w:pPr>
-        <w:pStyle w:val="Normal"/>
-        <w:bidi w:val="0"/>
-        <w:jc w:val="start"/>
+        <w:pStyle w:val="Heading3"/>
+        <w:numPr>
+          <w:ilvl w:val="0"/>
+          <w:numId w:val="1"/>
+        </w:numPr>
+        <w:ind w:hanging="0" w:start="0"/>
         <w:rPr/>
       </w:pPr>
       <w:r>
@@ -273,6 +275,21 @@
     </w:p>
     <w:p>
       <w:pPr>
+        <w:pStyle w:val="Heading4"/>
+        <w:numPr>
+          <w:ilvl w:val="0"/>
+          <w:numId w:val="1"/>
+        </w:numPr>
+        <w:ind w:hanging="0" w:start="0"/>
+        <w:rPr/>
+      </w:pPr>
+      <w:r>
+        <w:rPr/>
+        <w:t>To allow:</w:t>
+      </w:r>
+    </w:p>
+    <w:p>
+      <w:pPr>
         <w:pStyle w:val="Normal"/>
         <w:numPr>
           <w:ilvl w:val="0"/>
@@ -284,14 +301,20 @@
       </w:pPr>
       <w:r>
         <w:rPr/>
-        <w:t>To allow:</w:t>
-      </w:r>
-    </w:p>
-    <w:p>
-      <w:pPr>
-        <w:pStyle w:val="Normal"/>
-        <w:numPr>
-          <w:ilvl w:val="1"/>
+        <w:t xml:space="preserve">amake jete{go} dao. </w:t>
+        <w:tab/>
+        <w:tab/>
+        <w:tab/>
+        <w:tab/>
+        <w:tab/>
+        <w:t>[Let me go.]</w:t>
+      </w:r>
+    </w:p>
+    <w:p>
+      <w:pPr>
+        <w:pStyle w:val="Normal"/>
+        <w:numPr>
+          <w:ilvl w:val="0"/>
           <w:numId w:val="2"/>
         </w:numPr>
         <w:bidi w:val="0"/>
@@ -300,19 +323,19 @@
       </w:pPr>
       <w:r>
         <w:rPr/>
-        <w:t xml:space="preserve">amake jete{go} dao. </w:t>
-        <w:tab/>
-        <w:tab/>
-        <w:tab/>
-        <w:tab/>
-        <w:t>[Let me go.]</w:t>
-      </w:r>
-    </w:p>
-    <w:p>
-      <w:pPr>
-        <w:pStyle w:val="Normal"/>
-        <w:numPr>
-          <w:ilvl w:val="1"/>
+        <w:t>oke dhukte{enter} dao.</w:t>
+        <w:tab/>
+        <w:tab/>
+        <w:tab/>
+        <w:tab/>
+        <w:t>[Let him enter.]</w:t>
+      </w:r>
+    </w:p>
+    <w:p>
+      <w:pPr>
+        <w:pStyle w:val="Normal"/>
+        <w:numPr>
+          <w:ilvl w:val="0"/>
           <w:numId w:val="2"/>
         </w:numPr>
         <w:bidi w:val="0"/>
@@ -321,18 +344,19 @@
       </w:pPr>
       <w:r>
         <w:rPr/>
-        <w:t>oke dhukte{enter} dao.</w:t>
-        <w:tab/>
-        <w:tab/>
-        <w:tab/>
-        <w:t>[Let him enter.]</w:t>
-      </w:r>
-    </w:p>
-    <w:p>
-      <w:pPr>
-        <w:pStyle w:val="Normal"/>
-        <w:numPr>
-          <w:ilvl w:val="1"/>
+        <w:t xml:space="preserve">amake bolte{speak} dao. </w:t>
+        <w:tab/>
+        <w:tab/>
+        <w:tab/>
+        <w:tab/>
+        <w:t>[Let me speak.]</w:t>
+      </w:r>
+    </w:p>
+    <w:p>
+      <w:pPr>
+        <w:pStyle w:val="Normal"/>
+        <w:numPr>
+          <w:ilvl w:val="0"/>
           <w:numId w:val="2"/>
         </w:numPr>
         <w:bidi w:val="0"/>
@@ -341,18 +365,31 @@
       </w:pPr>
       <w:r>
         <w:rPr/>
-        <w:t xml:space="preserve">amake bolte{speak} dao. </w:t>
-        <w:tab/>
-        <w:tab/>
-        <w:tab/>
-        <w:t>[Let me speak.]</w:t>
-      </w:r>
-    </w:p>
-    <w:p>
-      <w:pPr>
-        <w:pStyle w:val="Normal"/>
-        <w:numPr>
-          <w:ilvl w:val="1"/>
+        <w:t xml:space="preserve">amake amar möto thakte{stay/dwell} dao. </w:t>
+        <w:tab/>
+        <w:t>[Let me be myself.]</w:t>
+      </w:r>
+    </w:p>
+    <w:p>
+      <w:pPr>
+        <w:pStyle w:val="Heading4"/>
+        <w:numPr>
+          <w:ilvl w:val="0"/>
+          <w:numId w:val="1"/>
+        </w:numPr>
+        <w:ind w:hanging="0" w:start="0"/>
+        <w:rPr/>
+      </w:pPr>
+      <w:r>
+        <w:rPr/>
+        <w:t>Completion:</w:t>
+      </w:r>
+    </w:p>
+    <w:p>
+      <w:pPr>
+        <w:pStyle w:val="Normal"/>
+        <w:numPr>
+          <w:ilvl w:val="0"/>
           <w:numId w:val="2"/>
         </w:numPr>
         <w:bidi w:val="0"/>
@@ -361,9 +398,10 @@
       </w:pPr>
       <w:r>
         <w:rPr/>
-        <w:t xml:space="preserve">amake amar möto thakte{stay/dwell} dao. </w:t>
-        <w:tab/>
-        <w:t>[Let me be myself.]</w:t>
+        <w:t>dörja khule{open} diyechi.</w:t>
+        <w:tab/>
+        <w:tab/>
+        <w:t>[I have opened the door.]</w:t>
       </w:r>
     </w:p>
     <w:p>
@@ -379,14 +417,17 @@
       </w:pPr>
       <w:r>
         <w:rPr/>
-        <w:t>Completion:</w:t>
-      </w:r>
-    </w:p>
-    <w:p>
-      <w:pPr>
-        <w:pStyle w:val="Normal"/>
-        <w:numPr>
-          <w:ilvl w:val="1"/>
+        <w:t>ami oke bole{tell} diyechi.</w:t>
+        <w:tab/>
+        <w:tab/>
+        <w:t>[I have already told/informed him/her.]</w:t>
+      </w:r>
+    </w:p>
+    <w:p>
+      <w:pPr>
+        <w:pStyle w:val="Normal"/>
+        <w:numPr>
+          <w:ilvl w:val="0"/>
           <w:numId w:val="2"/>
         </w:numPr>
         <w:bidi w:val="0"/>
@@ -395,17 +436,17 @@
       </w:pPr>
       <w:r>
         <w:rPr/>
-        <w:t>dörja khule{open} diyechi.</w:t>
-        <w:tab/>
-        <w:tab/>
-        <w:t>[I have opened the door.]</w:t>
-      </w:r>
-    </w:p>
-    <w:p>
-      <w:pPr>
-        <w:pStyle w:val="Normal"/>
-        <w:numPr>
-          <w:ilvl w:val="1"/>
+        <w:t>phele{drop/discard} dao.</w:t>
+        <w:tab/>
+        <w:tab/>
+        <w:t>[Drop it.]</w:t>
+      </w:r>
+    </w:p>
+    <w:p>
+      <w:pPr>
+        <w:pStyle w:val="Normal"/>
+        <w:numPr>
+          <w:ilvl w:val="0"/>
           <w:numId w:val="2"/>
         </w:numPr>
         <w:bidi w:val="0"/>
@@ -414,17 +455,17 @@
       </w:pPr>
       <w:r>
         <w:rPr/>
-        <w:t>ami oke bole{tell} diyechi.</w:t>
-        <w:tab/>
-        <w:tab/>
-        <w:t>[I have already told/informed him/her.]</w:t>
-      </w:r>
-    </w:p>
-    <w:p>
-      <w:pPr>
-        <w:pStyle w:val="Normal"/>
-        <w:numPr>
-          <w:ilvl w:val="1"/>
+        <w:t>laiṭ{electric lamp} jaliye dao.</w:t>
+        <w:tab/>
+        <w:tab/>
+        <w:t>[Turn on the lights.]</w:t>
+      </w:r>
+    </w:p>
+    <w:p>
+      <w:pPr>
+        <w:pStyle w:val="Normal"/>
+        <w:numPr>
+          <w:ilvl w:val="0"/>
           <w:numId w:val="2"/>
         </w:numPr>
         <w:bidi w:val="0"/>
@@ -433,17 +474,16 @@
       </w:pPr>
       <w:r>
         <w:rPr/>
-        <w:t>phele{drop/discard} dao.</w:t>
-        <w:tab/>
-        <w:tab/>
-        <w:t>[Drop it.]</w:t>
-      </w:r>
-    </w:p>
-    <w:p>
-      <w:pPr>
-        <w:pStyle w:val="Normal"/>
-        <w:numPr>
-          <w:ilvl w:val="1"/>
+        <w:t>bati{lamp} nibhiye{extinguish} dao.</w:t>
+        <w:tab/>
+        <w:t>[Turn off the lights.]</w:t>
+      </w:r>
+    </w:p>
+    <w:p>
+      <w:pPr>
+        <w:pStyle w:val="Normal"/>
+        <w:numPr>
+          <w:ilvl w:val="0"/>
           <w:numId w:val="2"/>
         </w:numPr>
         <w:bidi w:val="0"/>
@@ -452,66 +492,10 @@
       </w:pPr>
       <w:r>
         <w:rPr/>
-        <w:t>laiṭ{electric lamp} jaliye dao.</w:t>
-        <w:tab/>
-        <w:tab/>
-        <w:t>[Turn on the lights.]</w:t>
-      </w:r>
-    </w:p>
-    <w:p>
-      <w:pPr>
-        <w:pStyle w:val="Normal"/>
-        <w:numPr>
-          <w:ilvl w:val="1"/>
-          <w:numId w:val="2"/>
-        </w:numPr>
-        <w:bidi w:val="0"/>
-        <w:jc w:val="start"/>
-        <w:rPr/>
-      </w:pPr>
-      <w:r>
-        <w:rPr/>
-        <w:t>bati{lamp} nibhiye{extinguish} dao.</w:t>
-        <w:tab/>
-        <w:t>[T</w:t>
-      </w:r>
-      <w:r>
-        <w:rPr/>
-        <w:t>ur</w:t>
-      </w:r>
-      <w:r>
-        <w:rPr/>
-        <w:t>n off the lights.]</w:t>
-      </w:r>
-    </w:p>
-    <w:p>
-      <w:pPr>
-        <w:pStyle w:val="Normal"/>
-        <w:numPr>
-          <w:ilvl w:val="1"/>
-          <w:numId w:val="2"/>
-        </w:numPr>
-        <w:bidi w:val="0"/>
-        <w:jc w:val="start"/>
-        <w:rPr/>
-      </w:pPr>
-      <w:r>
-        <w:rPr/>
         <w:t>amake cheṛe{release/quit} dao.</w:t>
         <w:tab/>
         <w:tab/>
         <w:t>[Spare/Release me.]</w:t>
-      </w:r>
-    </w:p>
-    <w:p>
-      <w:pPr>
-        <w:pStyle w:val="Normal"/>
-        <w:bidi w:val="0"/>
-        <w:jc w:val="start"/>
-        <w:rPr/>
-      </w:pPr>
-      <w:r>
-        <w:rPr/>
       </w:r>
     </w:p>
     <w:sectPr>
@@ -533,7 +517,6 @@
     <w:lvl w:ilvl="0">
       <w:start w:val="1"/>
       <w:numFmt w:val="none"/>
-      <w:pStyle w:val="Heading1"/>
       <w:suff w:val="nothing"/>
       <w:lvlText w:val="%1"/>
       <w:lvlJc w:val="start"/>
@@ -543,11 +526,11 @@
         </w:tabs>
         <w:ind w:start="0" w:hanging="0"/>
       </w:pPr>
+      <w:rPr/>
     </w:lvl>
     <w:lvl w:ilvl="1">
       <w:start w:val="1"/>
       <w:numFmt w:val="none"/>
-      <w:pStyle w:val="Heading2"/>
       <w:suff w:val="nothing"/>
       <w:lvlText w:val="%2"/>
       <w:lvlJc w:val="start"/>
@@ -557,11 +540,11 @@
         </w:tabs>
         <w:ind w:start="0" w:hanging="0"/>
       </w:pPr>
+      <w:rPr/>
     </w:lvl>
     <w:lvl w:ilvl="2">
       <w:start w:val="1"/>
       <w:numFmt w:val="none"/>
-      <w:pStyle w:val="Heading3"/>
       <w:suff w:val="nothing"/>
       <w:lvlText w:val="%3"/>
       <w:lvlJc w:val="start"/>
@@ -571,11 +554,11 @@
         </w:tabs>
         <w:ind w:start="0" w:hanging="0"/>
       </w:pPr>
+      <w:rPr/>
     </w:lvl>
     <w:lvl w:ilvl="3">
       <w:start w:val="1"/>
       <w:numFmt w:val="none"/>
-      <w:pStyle w:val="Heading4"/>
       <w:suff w:val="nothing"/>
       <w:lvlText w:val="%4"/>
       <w:lvlJc w:val="start"/>
@@ -585,6 +568,7 @@
         </w:tabs>
         <w:ind w:start="0" w:hanging="0"/>
       </w:pPr>
+      <w:rPr/>
     </w:lvl>
     <w:lvl w:ilvl="4">
       <w:start w:val="1"/>
@@ -598,6 +582,7 @@
         </w:tabs>
         <w:ind w:start="0" w:hanging="0"/>
       </w:pPr>
+      <w:rPr/>
     </w:lvl>
     <w:lvl w:ilvl="5">
       <w:start w:val="1"/>
@@ -611,6 +596,7 @@
         </w:tabs>
         <w:ind w:start="0" w:hanging="0"/>
       </w:pPr>
+      <w:rPr/>
     </w:lvl>
     <w:lvl w:ilvl="6">
       <w:start w:val="1"/>
@@ -624,6 +610,7 @@
         </w:tabs>
         <w:ind w:start="0" w:hanging="0"/>
       </w:pPr>
+      <w:rPr/>
     </w:lvl>
     <w:lvl w:ilvl="7">
       <w:start w:val="1"/>
@@ -637,6 +624,7 @@
         </w:tabs>
         <w:ind w:start="0" w:hanging="0"/>
       </w:pPr>
+      <w:rPr/>
     </w:lvl>
     <w:lvl w:ilvl="8">
       <w:start w:val="1"/>
@@ -650,6 +638,7 @@
         </w:tabs>
         <w:ind w:start="0" w:hanging="0"/>
       </w:pPr>
+      <w:rPr/>
     </w:lvl>
   </w:abstractNum>
   <w:abstractNum w:abstractNumId="2">
@@ -924,6 +913,125 @@
       <w:rPr>
         <w:rFonts w:ascii="OpenSymbol" w:hAnsi="OpenSymbol" w:cs="OpenSymbol" w:hint="default"/>
       </w:rPr>
+    </w:lvl>
+  </w:abstractNum>
+  <w:abstractNum w:abstractNumId="4">
+    <w:lvl w:ilvl="0">
+      <w:start w:val="1"/>
+      <w:numFmt w:val="none"/>
+      <w:suff w:val="nothing"/>
+      <w:lvlText w:val=""/>
+      <w:lvlJc w:val="start"/>
+      <w:pPr>
+        <w:tabs>
+          <w:tab w:val="num" w:pos="0"/>
+        </w:tabs>
+        <w:ind w:start="0" w:hanging="0"/>
+      </w:pPr>
+    </w:lvl>
+    <w:lvl w:ilvl="1">
+      <w:start w:val="1"/>
+      <w:numFmt w:val="none"/>
+      <w:suff w:val="nothing"/>
+      <w:lvlText w:val=""/>
+      <w:lvlJc w:val="start"/>
+      <w:pPr>
+        <w:tabs>
+          <w:tab w:val="num" w:pos="0"/>
+        </w:tabs>
+        <w:ind w:start="0" w:hanging="0"/>
+      </w:pPr>
+    </w:lvl>
+    <w:lvl w:ilvl="2">
+      <w:start w:val="1"/>
+      <w:numFmt w:val="none"/>
+      <w:suff w:val="nothing"/>
+      <w:lvlText w:val=""/>
+      <w:lvlJc w:val="start"/>
+      <w:pPr>
+        <w:tabs>
+          <w:tab w:val="num" w:pos="0"/>
+        </w:tabs>
+        <w:ind w:start="0" w:hanging="0"/>
+      </w:pPr>
+    </w:lvl>
+    <w:lvl w:ilvl="3">
+      <w:start w:val="1"/>
+      <w:numFmt w:val="none"/>
+      <w:suff w:val="nothing"/>
+      <w:lvlText w:val=""/>
+      <w:lvlJc w:val="start"/>
+      <w:pPr>
+        <w:tabs>
+          <w:tab w:val="num" w:pos="0"/>
+        </w:tabs>
+        <w:ind w:start="0" w:hanging="0"/>
+      </w:pPr>
+    </w:lvl>
+    <w:lvl w:ilvl="4">
+      <w:start w:val="1"/>
+      <w:numFmt w:val="none"/>
+      <w:suff w:val="nothing"/>
+      <w:lvlText w:val=""/>
+      <w:lvlJc w:val="start"/>
+      <w:pPr>
+        <w:tabs>
+          <w:tab w:val="num" w:pos="0"/>
+        </w:tabs>
+        <w:ind w:start="0" w:hanging="0"/>
+      </w:pPr>
+    </w:lvl>
+    <w:lvl w:ilvl="5">
+      <w:start w:val="1"/>
+      <w:numFmt w:val="none"/>
+      <w:suff w:val="nothing"/>
+      <w:lvlText w:val=""/>
+      <w:lvlJc w:val="start"/>
+      <w:pPr>
+        <w:tabs>
+          <w:tab w:val="num" w:pos="0"/>
+        </w:tabs>
+        <w:ind w:start="0" w:hanging="0"/>
+      </w:pPr>
+    </w:lvl>
+    <w:lvl w:ilvl="6">
+      <w:start w:val="1"/>
+      <w:numFmt w:val="none"/>
+      <w:suff w:val="nothing"/>
+      <w:lvlText w:val=""/>
+      <w:lvlJc w:val="start"/>
+      <w:pPr>
+        <w:tabs>
+          <w:tab w:val="num" w:pos="0"/>
+        </w:tabs>
+        <w:ind w:start="0" w:hanging="0"/>
+      </w:pPr>
+    </w:lvl>
+    <w:lvl w:ilvl="7">
+      <w:start w:val="1"/>
+      <w:numFmt w:val="none"/>
+      <w:suff w:val="nothing"/>
+      <w:lvlText w:val=""/>
+      <w:lvlJc w:val="start"/>
+      <w:pPr>
+        <w:tabs>
+          <w:tab w:val="num" w:pos="0"/>
+        </w:tabs>
+        <w:ind w:start="0" w:hanging="0"/>
+      </w:pPr>
+    </w:lvl>
+    <w:lvl w:ilvl="8">
+      <w:start w:val="1"/>
+      <w:numFmt w:val="none"/>
+      <w:suff w:val="nothing"/>
+      <w:lvlText w:val=""/>
+      <w:lvlJc w:val="start"/>
+      <w:pPr>
+        <w:tabs>
+          <w:tab w:val="num" w:pos="0"/>
+        </w:tabs>
+        <w:ind w:start="0" w:hanging="0"/>
+      </w:pPr>
     </w:lvl>
   </w:abstractNum>
   <w:num w:numId="1">
@@ -935,6 +1043,9 @@
   <w:num w:numId="3">
     <w:abstractNumId w:val="3"/>
   </w:num>
+  <w:num w:numId="4">
+    <w:abstractNumId w:val="4"/>
+  </w:num>
 </w:numbering>
 </file>
 
@@ -962,9 +1073,7 @@
     <w:pPr>
       <w:widowControl/>
       <w:suppressAutoHyphens w:val="true"/>
-      <w:kinsoku w:val="true"/>
-      <w:overflowPunct w:val="true"/>
-      <w:autoSpaceDE w:val="true"/>
+      <w:overflowPunct w:val="false"/>
       <w:bidi w:val="0"/>
       <w:spacing w:before="0" w:after="0"/>
       <w:jc w:val="start"/>
@@ -992,10 +1101,10 @@
       <w:outlineLvl w:val="0"/>
     </w:pPr>
     <w:rPr>
-      <w:b/>
+      <w:b w:val="false"/>
       <w:bCs/>
       <w:sz w:val="36"/>
-      <w:szCs w:val="36"/>
+      <w:szCs w:val="42"/>
     </w:rPr>
   </w:style>
   <w:style w:type="paragraph" w:styleId="Heading2">
@@ -1012,11 +1121,11 @@
       <w:outlineLvl w:val="1"/>
     </w:pPr>
     <w:rPr>
-      <w:b/>
+      <w:b w:val="false"/>
       <w:bCs/>
       <w:color w:val="BF0041"/>
       <w:sz w:val="32"/>
-      <w:szCs w:val="32"/>
+      <w:szCs w:val="36"/>
     </w:rPr>
   </w:style>
   <w:style w:type="paragraph" w:styleId="Heading3">
@@ -1033,11 +1142,11 @@
       <w:outlineLvl w:val="2"/>
     </w:pPr>
     <w:rPr>
-      <w:b/>
+      <w:b w:val="false"/>
       <w:bCs/>
       <w:color w:val="800080"/>
       <w:sz w:val="28"/>
-      <w:szCs w:val="28"/>
+      <w:szCs w:val="32"/>
     </w:rPr>
   </w:style>
   <w:style w:type="paragraph" w:styleId="Heading4">
@@ -1054,17 +1163,17 @@
       <w:outlineLvl w:val="3"/>
     </w:pPr>
     <w:rPr>
-      <w:b/>
+      <w:b w:val="false"/>
       <w:bCs/>
       <w:i/>
       <w:iCs/>
       <w:color w:val="00A933"/>
       <w:sz w:val="26"/>
-      <w:szCs w:val="26"/>
+      <w:szCs w:val="30"/>
     </w:rPr>
   </w:style>
-  <w:style w:type="character" w:styleId="Bulletsuser">
-    <w:name w:val="Bullets (user)"/>
+  <w:style w:type="character" w:styleId="Bullets">
+    <w:name w:val="Bullets"/>
     <w:qFormat/>
     <w:rPr>
       <w:rFonts w:ascii="OpenSymbol" w:hAnsi="OpenSymbol" w:eastAsia="OpenSymbol" w:cs="OpenSymbol"/>
@@ -1074,13 +1183,6 @@
     <w:name w:val="Numbering Symbols"/>
     <w:qFormat/>
     <w:rPr/>
-  </w:style>
-  <w:style w:type="character" w:styleId="Bullets">
-    <w:name w:val="Bullets"/>
-    <w:qFormat/>
-    <w:rPr>
-      <w:rFonts w:ascii="OpenSymbol" w:hAnsi="OpenSymbol" w:eastAsia="OpenSymbol" w:cs="OpenSymbol"/>
-    </w:rPr>
   </w:style>
   <w:style w:type="paragraph" w:styleId="Heading">
     <w:name w:val="Heading"/>
@@ -1151,10 +1253,10 @@
       <w:jc w:val="center"/>
     </w:pPr>
     <w:rPr>
-      <w:b/>
+      <w:b w:val="false"/>
       <w:bCs/>
       <w:sz w:val="56"/>
-      <w:szCs w:val="56"/>
+      <w:szCs w:val="64"/>
     </w:rPr>
   </w:style>
   <w:style w:type="paragraph" w:styleId="Subtitle">
@@ -1167,8 +1269,9 @@
       <w:jc w:val="center"/>
     </w:pPr>
     <w:rPr>
+      <w:b w:val="false"/>
       <w:sz w:val="36"/>
-      <w:szCs w:val="36"/>
+      <w:szCs w:val="42"/>
     </w:rPr>
   </w:style>
 </w:styles>

</xml_diff>

<commit_message>
restructure compound verbs file
</commit_message>
<xml_diff>
--- a/lower_intermediate_stuffs/compound_verbs/compound_verbs_list_example.docx
+++ b/lower_intermediate_stuffs/compound_verbs/compound_verbs_list_example.docx
@@ -4,13 +4,12 @@
   <w:body>
     <w:p>
       <w:pPr>
-        <w:pStyle w:val="Heading1"/>
+        <w:pStyle w:val="Title"/>
         <w:numPr>
           <w:ilvl w:val="0"/>
           <w:numId w:val="1"/>
         </w:numPr>
         <w:spacing w:before="240" w:after="120"/>
-        <w:ind w:hanging="0" w:start="0"/>
         <w:rPr/>
       </w:pPr>
       <w:r>
@@ -26,20 +25,69 @@
         <w:rPr/>
       </w:pPr>
       <w:r>
-        <w:rPr/>
-        <w:t>Compund Verb = a non-finite verb + a finite verb</w:t>
-      </w:r>
-    </w:p>
-    <w:p>
-      <w:pPr>
-        <w:pStyle w:val="Heading2"/>
+        <w:rPr>
+          <w:shd w:fill="auto" w:val="clear"/>
+        </w:rPr>
+        <w:t xml:space="preserve">Structure:: </w:t>
+      </w:r>
+      <w:r>
+        <w:rPr>
+          <w:shd w:fill="81D41A" w:val="clear"/>
+        </w:rPr>
+        <w:t xml:space="preserve">1 </w:t>
+      </w:r>
+      <w:r>
+        <w:rPr>
+          <w:shd w:fill="81D41A" w:val="clear"/>
+        </w:rPr>
+        <w:t>Compund Verb</w:t>
+      </w:r>
+      <w:r>
+        <w:rPr/>
+        <w:t xml:space="preserve"> = </w:t>
+      </w:r>
+      <w:r>
+        <w:rPr>
+          <w:shd w:fill="81D41A" w:val="clear"/>
+        </w:rPr>
+        <w:t xml:space="preserve">1 </w:t>
+      </w:r>
+      <w:r>
+        <w:rPr>
+          <w:shd w:fill="81D41A" w:val="clear"/>
+        </w:rPr>
+        <w:t>non-finite verb</w:t>
+      </w:r>
+      <w:r>
+        <w:rPr/>
+        <w:t xml:space="preserve"> + </w:t>
+      </w:r>
+      <w:r>
+        <w:rPr>
+          <w:shd w:fill="81D41A" w:val="clear"/>
+        </w:rPr>
+        <w:t>1</w:t>
+      </w:r>
+      <w:r>
+        <w:rPr>
+          <w:shd w:fill="81D41A" w:val="clear"/>
+        </w:rPr>
+        <w:t xml:space="preserve"> finite verb</w:t>
+      </w:r>
+    </w:p>
+    <w:p>
+      <w:pPr>
+        <w:pStyle w:val="Heading1"/>
         <w:numPr>
           <w:ilvl w:val="0"/>
           <w:numId w:val="1"/>
         </w:numPr>
-        <w:ind w:hanging="0" w:start="0"/>
-        <w:rPr/>
-      </w:pPr>
+        <w:rPr/>
+      </w:pPr>
+      <w:r>
+        <w:rPr/>
+        <w:t xml:space="preserve">Compound Verb </w:t>
+      </w:r>
       <w:r>
         <w:rPr/>
         <w:t>Groups</w:t>
@@ -47,24 +95,45 @@
     </w:p>
     <w:p>
       <w:pPr>
+        <w:pStyle w:val="BodyText"/>
+        <w:rPr/>
+      </w:pPr>
+      <w:r>
+        <w:rPr/>
+        <w:t>A small number of finite verbs show up again &amp; again in these compound verbs.</w:t>
+        <w:br/>
+        <w:t>We'll group the compound verbs based on their finite verb component.</w:t>
+      </w:r>
+    </w:p>
+    <w:p>
+      <w:pPr>
         <w:pStyle w:val="Normal"/>
+        <w:rPr/>
+      </w:pPr>
+      <w:r>
+        <w:rPr/>
+        <w:t>Some of those finite verbs (their roots) are:</w:t>
+      </w:r>
+    </w:p>
+    <w:p>
+      <w:pPr>
+        <w:pStyle w:val="Normal"/>
+        <w:numPr>
+          <w:ilvl w:val="0"/>
+          <w:numId w:val="4"/>
+        </w:numPr>
         <w:bidi w:val="0"/>
         <w:jc w:val="start"/>
         <w:rPr/>
       </w:pPr>
       <w:r>
         <w:rPr/>
-        <w:t>A small number of finite verbs show up again &amp; again in these compound verbs.</w:t>
-      </w:r>
-    </w:p>
-    <w:p>
-      <w:pPr>
-        <w:pStyle w:val="BodyText"/>
-        <w:rPr/>
-      </w:pPr>
-      <w:r>
-        <w:rPr/>
-        <w:t>Some of those finite verbs (their roots) are:</w:t>
+        <w:t>ja</w:t>
+        <w:tab/>
+      </w:r>
+      <w:r>
+        <w:rPr/>
+        <w:t>যা</w:t>
       </w:r>
     </w:p>
     <w:p>
@@ -72,7 +141,7 @@
         <w:pStyle w:val="Normal"/>
         <w:numPr>
           <w:ilvl w:val="0"/>
-          <w:numId w:val="3"/>
+          <w:numId w:val="4"/>
         </w:numPr>
         <w:bidi w:val="0"/>
         <w:jc w:val="start"/>
@@ -80,7 +149,12 @@
       </w:pPr>
       <w:r>
         <w:rPr/>
-        <w:t>ja</w:t>
+        <w:t>dëkh</w:t>
+        <w:tab/>
+      </w:r>
+      <w:r>
+        <w:rPr/>
+        <w:t>দ্যাখ্</w:t>
       </w:r>
     </w:p>
     <w:p>
@@ -88,7 +162,7 @@
         <w:pStyle w:val="Normal"/>
         <w:numPr>
           <w:ilvl w:val="0"/>
-          <w:numId w:val="3"/>
+          <w:numId w:val="4"/>
         </w:numPr>
         <w:bidi w:val="0"/>
         <w:jc w:val="start"/>
@@ -96,7 +170,12 @@
       </w:pPr>
       <w:r>
         <w:rPr/>
-        <w:t>dëkh</w:t>
+        <w:t>pöṛ</w:t>
+        <w:tab/>
+      </w:r>
+      <w:r>
+        <w:rPr/>
+        <w:t>পড়্</w:t>
       </w:r>
     </w:p>
     <w:p>
@@ -104,7 +183,7 @@
         <w:pStyle w:val="Normal"/>
         <w:numPr>
           <w:ilvl w:val="0"/>
-          <w:numId w:val="3"/>
+          <w:numId w:val="4"/>
         </w:numPr>
         <w:bidi w:val="0"/>
         <w:jc w:val="start"/>
@@ -112,7 +191,12 @@
       </w:pPr>
       <w:r>
         <w:rPr/>
-        <w:t>pöṛ</w:t>
+        <w:t xml:space="preserve">di </w:t>
+        <w:tab/>
+      </w:r>
+      <w:r>
+        <w:rPr/>
+        <w:t>দি</w:t>
       </w:r>
     </w:p>
     <w:p>
@@ -120,7 +204,7 @@
         <w:pStyle w:val="Normal"/>
         <w:numPr>
           <w:ilvl w:val="0"/>
-          <w:numId w:val="3"/>
+          <w:numId w:val="4"/>
         </w:numPr>
         <w:bidi w:val="0"/>
         <w:jc w:val="start"/>
@@ -128,7 +212,12 @@
       </w:pPr>
       <w:r>
         <w:rPr/>
-        <w:t>di</w:t>
+        <w:t>ni</w:t>
+        <w:tab/>
+      </w:r>
+      <w:r>
+        <w:rPr/>
+        <w:t>নি</w:t>
       </w:r>
     </w:p>
     <w:p>
@@ -136,7 +225,7 @@
         <w:pStyle w:val="Normal"/>
         <w:numPr>
           <w:ilvl w:val="0"/>
-          <w:numId w:val="3"/>
+          <w:numId w:val="4"/>
         </w:numPr>
         <w:bidi w:val="0"/>
         <w:jc w:val="start"/>
@@ -144,7 +233,12 @@
       </w:pPr>
       <w:r>
         <w:rPr/>
-        <w:t>ni</w:t>
+        <w:t>phël</w:t>
+        <w:tab/>
+      </w:r>
+      <w:r>
+        <w:rPr/>
+        <w:t>ফেল্</w:t>
       </w:r>
     </w:p>
     <w:p>
@@ -152,7 +246,7 @@
         <w:pStyle w:val="Normal"/>
         <w:numPr>
           <w:ilvl w:val="0"/>
-          <w:numId w:val="3"/>
+          <w:numId w:val="4"/>
         </w:numPr>
         <w:bidi w:val="0"/>
         <w:jc w:val="start"/>
@@ -160,7 +254,12 @@
       </w:pPr>
       <w:r>
         <w:rPr/>
-        <w:t>phël</w:t>
+        <w:t>uṭh</w:t>
+        <w:tab/>
+      </w:r>
+      <w:r>
+        <w:rPr/>
+        <w:t>উঠ্</w:t>
       </w:r>
     </w:p>
     <w:p>
@@ -168,7 +267,7 @@
         <w:pStyle w:val="Normal"/>
         <w:numPr>
           <w:ilvl w:val="0"/>
-          <w:numId w:val="3"/>
+          <w:numId w:val="4"/>
         </w:numPr>
         <w:bidi w:val="0"/>
         <w:jc w:val="start"/>
@@ -176,7 +275,12 @@
       </w:pPr>
       <w:r>
         <w:rPr/>
-        <w:t>uṭh</w:t>
+        <w:t>lag</w:t>
+        <w:tab/>
+      </w:r>
+      <w:r>
+        <w:rPr/>
+        <w:t>লাগ্</w:t>
       </w:r>
     </w:p>
     <w:p>
@@ -184,7 +288,7 @@
         <w:pStyle w:val="Normal"/>
         <w:numPr>
           <w:ilvl w:val="0"/>
-          <w:numId w:val="3"/>
+          <w:numId w:val="4"/>
         </w:numPr>
         <w:bidi w:val="0"/>
         <w:jc w:val="start"/>
@@ -192,7 +296,12 @@
       </w:pPr>
       <w:r>
         <w:rPr/>
-        <w:t>lag</w:t>
+        <w:t>thak</w:t>
+        <w:tab/>
+      </w:r>
+      <w:r>
+        <w:rPr/>
+        <w:t>থাক্</w:t>
       </w:r>
     </w:p>
     <w:p>
@@ -200,7 +309,7 @@
         <w:pStyle w:val="Normal"/>
         <w:numPr>
           <w:ilvl w:val="0"/>
-          <w:numId w:val="3"/>
+          <w:numId w:val="4"/>
         </w:numPr>
         <w:bidi w:val="0"/>
         <w:jc w:val="start"/>
@@ -208,7 +317,26 @@
       </w:pPr>
       <w:r>
         <w:rPr/>
-        <w:t>thak</w:t>
+        <w:t>ash</w:t>
+        <w:tab/>
+      </w:r>
+      <w:r>
+        <w:rPr/>
+        <w:t>আস্</w:t>
+      </w:r>
+    </w:p>
+    <w:p>
+      <w:pPr>
+        <w:pStyle w:val="Heading1"/>
+        <w:numPr>
+          <w:ilvl w:val="0"/>
+          <w:numId w:val="1"/>
+        </w:numPr>
+        <w:rPr/>
+      </w:pPr>
+      <w:r>
+        <w:rPr/>
+        <w:t>Note that…</w:t>
       </w:r>
     </w:p>
     <w:p>
@@ -216,15 +344,92 @@
         <w:pStyle w:val="Normal"/>
         <w:numPr>
           <w:ilvl w:val="0"/>
-          <w:numId w:val="3"/>
-        </w:numPr>
-        <w:bidi w:val="0"/>
-        <w:jc w:val="start"/>
-        <w:rPr/>
-      </w:pPr>
-      <w:r>
-        <w:rPr/>
-        <w:t>ash</w:t>
+          <w:numId w:val="5"/>
+        </w:numPr>
+        <w:rPr/>
+      </w:pPr>
+      <w:r>
+        <w:rPr>
+          <w:b/>
+          <w:bCs/>
+        </w:rPr>
+        <w:t>Originality:</w:t>
+      </w:r>
+      <w:r>
+        <w:rPr/>
+        <w:t xml:space="preserve"> </w:t>
+      </w:r>
+      <w:r>
+        <w:rPr/>
+        <w:t>You can not invent usage of these compound verbs. These are like using appropriate prepositions in English, or phrasal verbs in English.</w:t>
+      </w:r>
+    </w:p>
+    <w:p>
+      <w:pPr>
+        <w:pStyle w:val="Normal"/>
+        <w:numPr>
+          <w:ilvl w:val="0"/>
+          <w:numId w:val="5"/>
+        </w:numPr>
+        <w:rPr/>
+      </w:pPr>
+      <w:r>
+        <w:rPr>
+          <w:b/>
+          <w:bCs/>
+        </w:rPr>
+        <w:t>Exposure:</w:t>
+      </w:r>
+      <w:r>
+        <w:rPr/>
+        <w:t xml:space="preserve"> </w:t>
+      </w:r>
+      <w:r>
+        <w:rPr/>
+        <w:t>The only way is to get exposed to more and more examples of these.</w:t>
+      </w:r>
+    </w:p>
+    <w:p>
+      <w:pPr>
+        <w:pStyle w:val="Normal"/>
+        <w:numPr>
+          <w:ilvl w:val="0"/>
+          <w:numId w:val="5"/>
+        </w:numPr>
+        <w:rPr/>
+      </w:pPr>
+      <w:r>
+        <w:rPr>
+          <w:b/>
+          <w:bCs/>
+        </w:rPr>
+        <w:t>Approach:</w:t>
+      </w:r>
+      <w:r>
+        <w:rPr/>
+        <w:t xml:space="preserve"> </w:t>
+      </w:r>
+      <w:r>
+        <w:rPr/>
+        <w:t>Our goal in this lesson is to explore some categorized examples  of these verbs, which may boost our pattern recognition in this topic.</w:t>
+      </w:r>
+    </w:p>
+    <w:p>
+      <w:pPr>
+        <w:pStyle w:val="Heading1"/>
+        <w:numPr>
+          <w:ilvl w:val="0"/>
+          <w:numId w:val="1"/>
+        </w:numPr>
+        <w:rPr/>
+      </w:pPr>
+      <w:r>
+        <w:rPr/>
+        <w:t>Example usa</w:t>
+      </w:r>
+      <w:r>
+        <w:rPr/>
+        <w:t>ges</w:t>
       </w:r>
     </w:p>
     <w:p>
@@ -239,14 +444,30 @@
       </w:pPr>
       <w:r>
         <w:rPr/>
-        <w:t>Example usage</w:t>
+        <w:t>ni- verbs (</w:t>
+      </w:r>
+      <w:r>
+        <w:rPr/>
+        <w:t>নি</w:t>
+      </w:r>
+      <w:r>
+        <w:rPr/>
+        <w:t xml:space="preserve">/ </w:t>
+      </w:r>
+      <w:r>
+        <w:rPr/>
+        <w:t>নেওয়া</w:t>
+      </w:r>
+      <w:r>
+        <w:rPr/>
+        <w:t>)</w:t>
       </w:r>
     </w:p>
     <w:p>
       <w:pPr>
         <w:pStyle w:val="Heading3"/>
         <w:numPr>
-          <w:ilvl w:val="0"/>
+          <w:ilvl w:val="2"/>
           <w:numId w:val="1"/>
         </w:numPr>
         <w:ind w:hanging="0" w:start="0"/>
@@ -254,6 +475,156 @@
       </w:pPr>
       <w:r>
         <w:rPr/>
+        <w:t>provid</w:t>
+      </w:r>
+      <w:r>
+        <w:rPr/>
+        <w:t>ing</w:t>
+      </w:r>
+      <w:r>
+        <w:rPr/>
+        <w:t xml:space="preserve"> a service for oneself</w:t>
+      </w:r>
+    </w:p>
+    <w:p>
+      <w:pPr>
+        <w:pStyle w:val="BodyText"/>
+        <w:numPr>
+          <w:ilvl w:val="0"/>
+          <w:numId w:val="6"/>
+        </w:numPr>
+        <w:rPr/>
+      </w:pPr>
+      <w:r>
+        <w:rPr/>
+        <w:t>khatay likhe nao.</w:t>
+        <w:tab/>
+        <w:t>[Note it down in your copies.]</w:t>
+      </w:r>
+    </w:p>
+    <w:p>
+      <w:pPr>
+        <w:pStyle w:val="BodyText"/>
+        <w:numPr>
+          <w:ilvl w:val="0"/>
+          <w:numId w:val="6"/>
+        </w:numPr>
+        <w:rPr/>
+      </w:pPr>
+      <w:r>
+        <w:rPr/>
+        <w:t>boigulo guchiye nao.</w:t>
+        <w:tab/>
+        <w:t>[Organize the books.]</w:t>
+      </w:r>
+    </w:p>
+    <w:p>
+      <w:pPr>
+        <w:pStyle w:val="Heading2"/>
+        <w:numPr>
+          <w:ilvl w:val="1"/>
+          <w:numId w:val="1"/>
+        </w:numPr>
+        <w:ind w:hanging="0" w:start="0"/>
+        <w:rPr/>
+      </w:pPr>
+      <w:r>
+        <w:rPr/>
+        <w:t>phël- verbs (</w:t>
+      </w:r>
+      <w:r>
+        <w:rPr/>
+        <w:t>ফেল</w:t>
+      </w:r>
+      <w:r>
+        <w:rPr/>
+        <w:t xml:space="preserve">/ </w:t>
+      </w:r>
+      <w:r>
+        <w:rPr/>
+        <w:t>ফেলা</w:t>
+      </w:r>
+      <w:r>
+        <w:rPr/>
+        <w:t>)</w:t>
+      </w:r>
+    </w:p>
+    <w:p>
+      <w:pPr>
+        <w:pStyle w:val="Heading3"/>
+        <w:numPr>
+          <w:ilvl w:val="2"/>
+          <w:numId w:val="1"/>
+        </w:numPr>
+        <w:ind w:hanging="0" w:start="0"/>
+        <w:rPr/>
+      </w:pPr>
+      <w:r>
+        <w:rPr/>
+        <w:t>completion</w:t>
+      </w:r>
+    </w:p>
+    <w:p>
+      <w:pPr>
+        <w:pStyle w:val="BodyText"/>
+        <w:numPr>
+          <w:ilvl w:val="0"/>
+          <w:numId w:val="2"/>
+        </w:numPr>
+        <w:rPr/>
+      </w:pPr>
+      <w:r>
+        <w:rPr/>
+        <w:t>mishṭigulo kheye phëlo.</w:t>
+        <w:tab/>
+      </w:r>
+      <w:r>
+        <w:rPr/>
+        <w:t>[Eat the sweets. (Get done with eating the sweets.)]</w:t>
+      </w:r>
+    </w:p>
+    <w:p>
+      <w:pPr>
+        <w:pStyle w:val="Heading3"/>
+        <w:numPr>
+          <w:ilvl w:val="2"/>
+          <w:numId w:val="1"/>
+        </w:numPr>
+        <w:ind w:hanging="0" w:start="0"/>
+        <w:rPr/>
+      </w:pPr>
+      <w:r>
+        <w:rPr/>
+        <w:t>involuntary or impulsively doing something</w:t>
+      </w:r>
+    </w:p>
+    <w:p>
+      <w:pPr>
+        <w:pStyle w:val="BodyText"/>
+        <w:numPr>
+          <w:ilvl w:val="0"/>
+          <w:numId w:val="9"/>
+        </w:numPr>
+        <w:rPr/>
+      </w:pPr>
+      <w:r>
+        <w:rPr/>
+        <w:t>chelera heshe phello.</w:t>
+        <w:tab/>
+        <w:t>[The boys couldn't help but (or ended up) laughing.]</w:t>
+      </w:r>
+    </w:p>
+    <w:p>
+      <w:pPr>
+        <w:pStyle w:val="Heading2"/>
+        <w:numPr>
+          <w:ilvl w:val="1"/>
+          <w:numId w:val="1"/>
+        </w:numPr>
+        <w:rPr/>
+      </w:pPr>
+      <w:r>
+        <w:rPr/>
         <w:t>di- verbs (</w:t>
       </w:r>
       <w:r>
@@ -275,227 +646,258 @@
     </w:p>
     <w:p>
       <w:pPr>
-        <w:pStyle w:val="Heading4"/>
-        <w:numPr>
-          <w:ilvl w:val="0"/>
+        <w:pStyle w:val="Heading3"/>
+        <w:numPr>
+          <w:ilvl w:val="2"/>
           <w:numId w:val="1"/>
         </w:numPr>
+        <w:rPr/>
+      </w:pPr>
+      <w:r>
+        <w:rPr/>
+        <w:t>to allow</w:t>
+      </w:r>
+    </w:p>
+    <w:p>
+      <w:pPr>
+        <w:pStyle w:val="BodyText"/>
+        <w:numPr>
+          <w:ilvl w:val="0"/>
+          <w:numId w:val="3"/>
+        </w:numPr>
+        <w:rPr/>
+      </w:pPr>
+      <w:r>
+        <w:rPr/>
+        <w:t xml:space="preserve">amake jete{go} dao. </w:t>
+        <w:tab/>
+        <w:tab/>
+        <w:tab/>
+        <w:tab/>
+        <w:tab/>
+        <w:t>[Let me go.]</w:t>
+      </w:r>
+    </w:p>
+    <w:p>
+      <w:pPr>
+        <w:pStyle w:val="BodyText"/>
+        <w:numPr>
+          <w:ilvl w:val="0"/>
+          <w:numId w:val="3"/>
+        </w:numPr>
+        <w:rPr/>
+      </w:pPr>
+      <w:r>
+        <w:rPr/>
+        <w:t>oke dhukte{enter} dao.</w:t>
+        <w:tab/>
+        <w:tab/>
+        <w:tab/>
+        <w:tab/>
+        <w:t>[Let him enter.]</w:t>
+      </w:r>
+    </w:p>
+    <w:p>
+      <w:pPr>
+        <w:pStyle w:val="BodyText"/>
+        <w:numPr>
+          <w:ilvl w:val="0"/>
+          <w:numId w:val="3"/>
+        </w:numPr>
+        <w:rPr/>
+      </w:pPr>
+      <w:r>
+        <w:rPr/>
+        <w:t xml:space="preserve">amake bolte{speak} dao. </w:t>
+        <w:tab/>
+        <w:tab/>
+        <w:tab/>
+        <w:tab/>
+        <w:t>[Let me speak.]</w:t>
+      </w:r>
+    </w:p>
+    <w:p>
+      <w:pPr>
+        <w:pStyle w:val="BodyText"/>
+        <w:numPr>
+          <w:ilvl w:val="0"/>
+          <w:numId w:val="3"/>
+        </w:numPr>
+        <w:rPr/>
+      </w:pPr>
+      <w:r>
+        <w:rPr/>
+        <w:t xml:space="preserve">amake amar möto thakte{stay/dwell} dao. </w:t>
+        <w:tab/>
+        <w:t>[Let me be myself.]</w:t>
+      </w:r>
+    </w:p>
+    <w:p>
+      <w:pPr>
+        <w:pStyle w:val="Heading3"/>
+        <w:numPr>
+          <w:ilvl w:val="2"/>
+          <w:numId w:val="1"/>
+        </w:numPr>
+        <w:rPr/>
+      </w:pPr>
+      <w:r>
+        <w:rPr/>
+        <w:t>completion</w:t>
+      </w:r>
+    </w:p>
+    <w:p>
+      <w:pPr>
+        <w:pStyle w:val="BodyText"/>
+        <w:numPr>
+          <w:ilvl w:val="0"/>
+          <w:numId w:val="7"/>
+        </w:numPr>
+        <w:rPr/>
+      </w:pPr>
+      <w:r>
+        <w:rPr/>
+        <w:t>dörja khule{open} diyechi.</w:t>
+        <w:tab/>
+        <w:tab/>
+        <w:t>[I have opened the door.]</w:t>
+      </w:r>
+    </w:p>
+    <w:p>
+      <w:pPr>
+        <w:pStyle w:val="BodyText"/>
+        <w:numPr>
+          <w:ilvl w:val="0"/>
+          <w:numId w:val="7"/>
+        </w:numPr>
+        <w:rPr/>
+      </w:pPr>
+      <w:r>
+        <w:rPr/>
+        <w:t>ami oke bole{tell} diyechi.</w:t>
+        <w:tab/>
+        <w:tab/>
+        <w:t>[I have already told/informed him/her.]</w:t>
+      </w:r>
+    </w:p>
+    <w:p>
+      <w:pPr>
+        <w:pStyle w:val="BodyText"/>
+        <w:numPr>
+          <w:ilvl w:val="0"/>
+          <w:numId w:val="7"/>
+        </w:numPr>
+        <w:rPr/>
+      </w:pPr>
+      <w:r>
+        <w:rPr/>
+        <w:t>phele{drop/discard} dao.</w:t>
+        <w:tab/>
+        <w:tab/>
+        <w:t>[Drop it.]</w:t>
+      </w:r>
+    </w:p>
+    <w:p>
+      <w:pPr>
+        <w:pStyle w:val="BodyText"/>
+        <w:numPr>
+          <w:ilvl w:val="0"/>
+          <w:numId w:val="7"/>
+        </w:numPr>
+        <w:rPr/>
+      </w:pPr>
+      <w:r>
+        <w:rPr/>
+        <w:t>laiṭ{electric lamp} jaliye dao.</w:t>
+        <w:tab/>
+        <w:tab/>
+        <w:t>[Turn on the lights.]</w:t>
+      </w:r>
+    </w:p>
+    <w:p>
+      <w:pPr>
+        <w:pStyle w:val="BodyText"/>
+        <w:numPr>
+          <w:ilvl w:val="0"/>
+          <w:numId w:val="7"/>
+        </w:numPr>
+        <w:rPr/>
+      </w:pPr>
+      <w:r>
+        <w:rPr/>
+        <w:t>bati{lamp} nibhiye{extinguish} dao.</w:t>
+        <w:tab/>
+        <w:t>[Turn off the lights.]</w:t>
+      </w:r>
+    </w:p>
+    <w:p>
+      <w:pPr>
+        <w:pStyle w:val="BodyText"/>
+        <w:numPr>
+          <w:ilvl w:val="0"/>
+          <w:numId w:val="7"/>
+        </w:numPr>
+        <w:rPr/>
+      </w:pPr>
+      <w:r>
+        <w:rPr/>
+        <w:t>amake cheṛe{release/quit} dao.</w:t>
+        <w:tab/>
+        <w:tab/>
+        <w:t>[Spare/Release me.]</w:t>
+      </w:r>
+    </w:p>
+    <w:p>
+      <w:pPr>
+        <w:pStyle w:val="Heading3"/>
+        <w:numPr>
+          <w:ilvl w:val="2"/>
+          <w:numId w:val="1"/>
+        </w:numPr>
         <w:ind w:hanging="0" w:start="0"/>
         <w:rPr/>
       </w:pPr>
       <w:r>
         <w:rPr/>
-        <w:t>To allow:</w:t>
-      </w:r>
-    </w:p>
-    <w:p>
-      <w:pPr>
-        <w:pStyle w:val="Normal"/>
-        <w:numPr>
-          <w:ilvl w:val="0"/>
-          <w:numId w:val="2"/>
-        </w:numPr>
-        <w:bidi w:val="0"/>
-        <w:jc w:val="start"/>
-        <w:rPr/>
-      </w:pPr>
-      <w:r>
-        <w:rPr/>
-        <w:t xml:space="preserve">amake jete{go} dao. </w:t>
-        <w:tab/>
-        <w:tab/>
-        <w:tab/>
-        <w:tab/>
-        <w:tab/>
-        <w:t>[Let me go.]</w:t>
-      </w:r>
-    </w:p>
-    <w:p>
-      <w:pPr>
-        <w:pStyle w:val="Normal"/>
-        <w:numPr>
-          <w:ilvl w:val="0"/>
-          <w:numId w:val="2"/>
-        </w:numPr>
-        <w:bidi w:val="0"/>
-        <w:jc w:val="start"/>
-        <w:rPr/>
-      </w:pPr>
-      <w:r>
-        <w:rPr/>
-        <w:t>oke dhukte{enter} dao.</w:t>
-        <w:tab/>
-        <w:tab/>
-        <w:tab/>
-        <w:tab/>
-        <w:t>[Let him enter.]</w:t>
-      </w:r>
-    </w:p>
-    <w:p>
-      <w:pPr>
-        <w:pStyle w:val="Normal"/>
-        <w:numPr>
-          <w:ilvl w:val="0"/>
-          <w:numId w:val="2"/>
-        </w:numPr>
-        <w:bidi w:val="0"/>
-        <w:jc w:val="start"/>
-        <w:rPr/>
-      </w:pPr>
-      <w:r>
-        <w:rPr/>
-        <w:t xml:space="preserve">amake bolte{speak} dao. </w:t>
-        <w:tab/>
-        <w:tab/>
-        <w:tab/>
-        <w:tab/>
-        <w:t>[Let me speak.]</w:t>
-      </w:r>
-    </w:p>
-    <w:p>
-      <w:pPr>
-        <w:pStyle w:val="Normal"/>
-        <w:numPr>
-          <w:ilvl w:val="0"/>
-          <w:numId w:val="2"/>
-        </w:numPr>
-        <w:bidi w:val="0"/>
-        <w:jc w:val="start"/>
-        <w:rPr/>
-      </w:pPr>
-      <w:r>
-        <w:rPr/>
-        <w:t xml:space="preserve">amake amar möto thakte{stay/dwell} dao. </w:t>
-        <w:tab/>
-        <w:t>[Let me be myself.]</w:t>
-      </w:r>
-    </w:p>
-    <w:p>
-      <w:pPr>
-        <w:pStyle w:val="Heading4"/>
-        <w:numPr>
-          <w:ilvl w:val="0"/>
-          <w:numId w:val="1"/>
-        </w:numPr>
-        <w:ind w:hanging="0" w:start="0"/>
-        <w:rPr/>
-      </w:pPr>
-      <w:r>
-        <w:rPr/>
-        <w:t>Completion:</w:t>
-      </w:r>
-    </w:p>
-    <w:p>
-      <w:pPr>
-        <w:pStyle w:val="Normal"/>
-        <w:numPr>
-          <w:ilvl w:val="0"/>
-          <w:numId w:val="2"/>
-        </w:numPr>
-        <w:bidi w:val="0"/>
-        <w:jc w:val="start"/>
-        <w:rPr/>
-      </w:pPr>
-      <w:r>
-        <w:rPr/>
-        <w:t>dörja khule{open} diyechi.</w:t>
-        <w:tab/>
-        <w:tab/>
-        <w:t>[I have opened the door.]</w:t>
-      </w:r>
-    </w:p>
-    <w:p>
-      <w:pPr>
-        <w:pStyle w:val="Normal"/>
-        <w:numPr>
-          <w:ilvl w:val="0"/>
-          <w:numId w:val="2"/>
-        </w:numPr>
-        <w:bidi w:val="0"/>
-        <w:jc w:val="start"/>
-        <w:rPr/>
-      </w:pPr>
-      <w:r>
-        <w:rPr/>
-        <w:t>ami oke bole{tell} diyechi.</w:t>
-        <w:tab/>
-        <w:tab/>
-        <w:t>[I have already told/informed him/her.]</w:t>
-      </w:r>
-    </w:p>
-    <w:p>
-      <w:pPr>
-        <w:pStyle w:val="Normal"/>
-        <w:numPr>
-          <w:ilvl w:val="0"/>
-          <w:numId w:val="2"/>
-        </w:numPr>
-        <w:bidi w:val="0"/>
-        <w:jc w:val="start"/>
-        <w:rPr/>
-      </w:pPr>
-      <w:r>
-        <w:rPr/>
-        <w:t>phele{drop/discard} dao.</w:t>
-        <w:tab/>
-        <w:tab/>
-        <w:t>[Drop it.]</w:t>
-      </w:r>
-    </w:p>
-    <w:p>
-      <w:pPr>
-        <w:pStyle w:val="Normal"/>
-        <w:numPr>
-          <w:ilvl w:val="0"/>
-          <w:numId w:val="2"/>
-        </w:numPr>
-        <w:bidi w:val="0"/>
-        <w:jc w:val="start"/>
-        <w:rPr/>
-      </w:pPr>
-      <w:r>
-        <w:rPr/>
-        <w:t>laiṭ{electric lamp} jaliye dao.</w:t>
-        <w:tab/>
-        <w:tab/>
-        <w:t>[Turn on the lights.]</w:t>
-      </w:r>
-    </w:p>
-    <w:p>
-      <w:pPr>
-        <w:pStyle w:val="Normal"/>
-        <w:numPr>
-          <w:ilvl w:val="0"/>
-          <w:numId w:val="2"/>
-        </w:numPr>
-        <w:bidi w:val="0"/>
-        <w:jc w:val="start"/>
-        <w:rPr/>
-      </w:pPr>
-      <w:r>
-        <w:rPr/>
-        <w:t>bati{lamp} nibhiye{extinguish} dao.</w:t>
-        <w:tab/>
-        <w:t>[Turn off the lights.]</w:t>
-      </w:r>
-    </w:p>
-    <w:p>
-      <w:pPr>
-        <w:pStyle w:val="Normal"/>
-        <w:numPr>
-          <w:ilvl w:val="0"/>
-          <w:numId w:val="2"/>
-        </w:numPr>
-        <w:bidi w:val="0"/>
-        <w:jc w:val="start"/>
-        <w:rPr/>
-      </w:pPr>
-      <w:r>
-        <w:rPr/>
-        <w:t>amake cheṛe{release/quit} dao.</w:t>
-        <w:tab/>
-        <w:tab/>
-        <w:t>[Spare/Release me.]</w:t>
+        <w:t xml:space="preserve">providing a service </w:t>
+      </w:r>
+      <w:r>
+        <w:rPr/>
+        <w:t>for someone else</w:t>
+      </w:r>
+    </w:p>
+    <w:p>
+      <w:pPr>
+        <w:pStyle w:val="BodyText"/>
+        <w:numPr>
+          <w:ilvl w:val="0"/>
+          <w:numId w:val="8"/>
+        </w:numPr>
+        <w:rPr/>
+      </w:pPr>
+      <w:r>
+        <w:rPr/>
+        <w:t>amake ruṭi baniye dao.</w:t>
+        <w:tab/>
+        <w:t>[Make breads for me.]</w:t>
+      </w:r>
+    </w:p>
+    <w:p>
+      <w:pPr>
+        <w:pStyle w:val="BodyText"/>
+        <w:numPr>
+          <w:ilvl w:val="0"/>
+          <w:numId w:val="8"/>
+        </w:numPr>
+        <w:spacing w:before="0" w:after="140"/>
+        <w:rPr/>
+      </w:pPr>
+      <w:r>
+        <w:rPr/>
+        <w:t>kënṭa khule dao.</w:t>
+        <w:tab/>
+        <w:tab/>
+        <w:t>[Open the can for me.]</w:t>
       </w:r>
     </w:p>
     <w:sectPr>
@@ -918,6 +1320,810 @@
   <w:abstractNum w:abstractNumId="4">
     <w:lvl w:ilvl="0">
       <w:start w:val="1"/>
+      <w:numFmt w:val="bullet"/>
+      <w:lvlText w:val=""/>
+      <w:lvlJc w:val="start"/>
+      <w:pPr>
+        <w:tabs>
+          <w:tab w:val="num" w:pos="720"/>
+        </w:tabs>
+        <w:ind w:start="720" w:hanging="360"/>
+      </w:pPr>
+      <w:rPr>
+        <w:rFonts w:ascii="Symbol" w:hAnsi="Symbol" w:cs="Symbol" w:hint="default"/>
+      </w:rPr>
+    </w:lvl>
+    <w:lvl w:ilvl="1">
+      <w:start w:val="1"/>
+      <w:numFmt w:val="bullet"/>
+      <w:lvlText w:val="◦"/>
+      <w:lvlJc w:val="start"/>
+      <w:pPr>
+        <w:tabs>
+          <w:tab w:val="num" w:pos="1080"/>
+        </w:tabs>
+        <w:ind w:start="1080" w:hanging="360"/>
+      </w:pPr>
+      <w:rPr>
+        <w:rFonts w:ascii="OpenSymbol" w:hAnsi="OpenSymbol" w:cs="OpenSymbol" w:hint="default"/>
+      </w:rPr>
+    </w:lvl>
+    <w:lvl w:ilvl="2">
+      <w:start w:val="1"/>
+      <w:numFmt w:val="bullet"/>
+      <w:lvlText w:val="▪"/>
+      <w:lvlJc w:val="start"/>
+      <w:pPr>
+        <w:tabs>
+          <w:tab w:val="num" w:pos="1440"/>
+        </w:tabs>
+        <w:ind w:start="1440" w:hanging="360"/>
+      </w:pPr>
+      <w:rPr>
+        <w:rFonts w:ascii="OpenSymbol" w:hAnsi="OpenSymbol" w:cs="OpenSymbol" w:hint="default"/>
+      </w:rPr>
+    </w:lvl>
+    <w:lvl w:ilvl="3">
+      <w:start w:val="1"/>
+      <w:numFmt w:val="bullet"/>
+      <w:lvlText w:val=""/>
+      <w:lvlJc w:val="start"/>
+      <w:pPr>
+        <w:tabs>
+          <w:tab w:val="num" w:pos="1800"/>
+        </w:tabs>
+        <w:ind w:start="1800" w:hanging="360"/>
+      </w:pPr>
+      <w:rPr>
+        <w:rFonts w:ascii="Symbol" w:hAnsi="Symbol" w:cs="Symbol" w:hint="default"/>
+      </w:rPr>
+    </w:lvl>
+    <w:lvl w:ilvl="4">
+      <w:start w:val="1"/>
+      <w:numFmt w:val="bullet"/>
+      <w:lvlText w:val="◦"/>
+      <w:lvlJc w:val="start"/>
+      <w:pPr>
+        <w:tabs>
+          <w:tab w:val="num" w:pos="2160"/>
+        </w:tabs>
+        <w:ind w:start="2160" w:hanging="360"/>
+      </w:pPr>
+      <w:rPr>
+        <w:rFonts w:ascii="OpenSymbol" w:hAnsi="OpenSymbol" w:cs="OpenSymbol" w:hint="default"/>
+      </w:rPr>
+    </w:lvl>
+    <w:lvl w:ilvl="5">
+      <w:start w:val="1"/>
+      <w:numFmt w:val="bullet"/>
+      <w:lvlText w:val="▪"/>
+      <w:lvlJc w:val="start"/>
+      <w:pPr>
+        <w:tabs>
+          <w:tab w:val="num" w:pos="2520"/>
+        </w:tabs>
+        <w:ind w:start="2520" w:hanging="360"/>
+      </w:pPr>
+      <w:rPr>
+        <w:rFonts w:ascii="OpenSymbol" w:hAnsi="OpenSymbol" w:cs="OpenSymbol" w:hint="default"/>
+      </w:rPr>
+    </w:lvl>
+    <w:lvl w:ilvl="6">
+      <w:start w:val="1"/>
+      <w:numFmt w:val="bullet"/>
+      <w:lvlText w:val=""/>
+      <w:lvlJc w:val="start"/>
+      <w:pPr>
+        <w:tabs>
+          <w:tab w:val="num" w:pos="2880"/>
+        </w:tabs>
+        <w:ind w:start="2880" w:hanging="360"/>
+      </w:pPr>
+      <w:rPr>
+        <w:rFonts w:ascii="Symbol" w:hAnsi="Symbol" w:cs="Symbol" w:hint="default"/>
+      </w:rPr>
+    </w:lvl>
+    <w:lvl w:ilvl="7">
+      <w:start w:val="1"/>
+      <w:numFmt w:val="bullet"/>
+      <w:lvlText w:val="◦"/>
+      <w:lvlJc w:val="start"/>
+      <w:pPr>
+        <w:tabs>
+          <w:tab w:val="num" w:pos="3240"/>
+        </w:tabs>
+        <w:ind w:start="3240" w:hanging="360"/>
+      </w:pPr>
+      <w:rPr>
+        <w:rFonts w:ascii="OpenSymbol" w:hAnsi="OpenSymbol" w:cs="OpenSymbol" w:hint="default"/>
+      </w:rPr>
+    </w:lvl>
+    <w:lvl w:ilvl="8">
+      <w:start w:val="1"/>
+      <w:numFmt w:val="bullet"/>
+      <w:lvlText w:val="▪"/>
+      <w:lvlJc w:val="start"/>
+      <w:pPr>
+        <w:tabs>
+          <w:tab w:val="num" w:pos="3600"/>
+        </w:tabs>
+        <w:ind w:start="3600" w:hanging="360"/>
+      </w:pPr>
+      <w:rPr>
+        <w:rFonts w:ascii="OpenSymbol" w:hAnsi="OpenSymbol" w:cs="OpenSymbol" w:hint="default"/>
+      </w:rPr>
+    </w:lvl>
+  </w:abstractNum>
+  <w:abstractNum w:abstractNumId="5">
+    <w:lvl w:ilvl="0">
+      <w:start w:val="1"/>
+      <w:numFmt w:val="lowerLetter"/>
+      <w:lvlText w:val="%1)"/>
+      <w:lvlJc w:val="start"/>
+      <w:pPr>
+        <w:tabs>
+          <w:tab w:val="num" w:pos="720"/>
+        </w:tabs>
+        <w:ind w:start="720" w:hanging="360"/>
+      </w:pPr>
+      <w:rPr/>
+    </w:lvl>
+    <w:lvl w:ilvl="1">
+      <w:start w:val="1"/>
+      <w:numFmt w:val="lowerRoman"/>
+      <w:lvlText w:val="%2."/>
+      <w:lvlJc w:val="start"/>
+      <w:pPr>
+        <w:tabs>
+          <w:tab w:val="num" w:pos="1080"/>
+        </w:tabs>
+        <w:ind w:start="1080" w:hanging="360"/>
+      </w:pPr>
+      <w:rPr/>
+    </w:lvl>
+    <w:lvl w:ilvl="2">
+      <w:start w:val="1"/>
+      <w:numFmt w:val="lowerRoman"/>
+      <w:lvlText w:val="%3."/>
+      <w:lvlJc w:val="start"/>
+      <w:pPr>
+        <w:tabs>
+          <w:tab w:val="num" w:pos="1440"/>
+        </w:tabs>
+        <w:ind w:start="1440" w:hanging="360"/>
+      </w:pPr>
+      <w:rPr/>
+    </w:lvl>
+    <w:lvl w:ilvl="3">
+      <w:start w:val="1"/>
+      <w:numFmt w:val="lowerRoman"/>
+      <w:lvlText w:val="%4."/>
+      <w:lvlJc w:val="start"/>
+      <w:pPr>
+        <w:tabs>
+          <w:tab w:val="num" w:pos="1800"/>
+        </w:tabs>
+        <w:ind w:start="1800" w:hanging="360"/>
+      </w:pPr>
+      <w:rPr/>
+    </w:lvl>
+    <w:lvl w:ilvl="4">
+      <w:start w:val="1"/>
+      <w:numFmt w:val="lowerRoman"/>
+      <w:lvlText w:val="%5."/>
+      <w:lvlJc w:val="start"/>
+      <w:pPr>
+        <w:tabs>
+          <w:tab w:val="num" w:pos="2160"/>
+        </w:tabs>
+        <w:ind w:start="2160" w:hanging="360"/>
+      </w:pPr>
+      <w:rPr/>
+    </w:lvl>
+    <w:lvl w:ilvl="5">
+      <w:start w:val="1"/>
+      <w:numFmt w:val="lowerRoman"/>
+      <w:lvlText w:val="%6."/>
+      <w:lvlJc w:val="start"/>
+      <w:pPr>
+        <w:tabs>
+          <w:tab w:val="num" w:pos="2520"/>
+        </w:tabs>
+        <w:ind w:start="2520" w:hanging="360"/>
+      </w:pPr>
+      <w:rPr/>
+    </w:lvl>
+    <w:lvl w:ilvl="6">
+      <w:start w:val="1"/>
+      <w:numFmt w:val="lowerRoman"/>
+      <w:lvlText w:val="%7."/>
+      <w:lvlJc w:val="start"/>
+      <w:pPr>
+        <w:tabs>
+          <w:tab w:val="num" w:pos="2880"/>
+        </w:tabs>
+        <w:ind w:start="2880" w:hanging="360"/>
+      </w:pPr>
+      <w:rPr/>
+    </w:lvl>
+    <w:lvl w:ilvl="7">
+      <w:start w:val="1"/>
+      <w:numFmt w:val="lowerRoman"/>
+      <w:lvlText w:val="%8."/>
+      <w:lvlJc w:val="start"/>
+      <w:pPr>
+        <w:tabs>
+          <w:tab w:val="num" w:pos="3240"/>
+        </w:tabs>
+        <w:ind w:start="3240" w:hanging="360"/>
+      </w:pPr>
+      <w:rPr/>
+    </w:lvl>
+    <w:lvl w:ilvl="8">
+      <w:start w:val="1"/>
+      <w:numFmt w:val="lowerRoman"/>
+      <w:lvlText w:val="%9."/>
+      <w:lvlJc w:val="start"/>
+      <w:pPr>
+        <w:tabs>
+          <w:tab w:val="num" w:pos="3600"/>
+        </w:tabs>
+        <w:ind w:start="3600" w:hanging="360"/>
+      </w:pPr>
+      <w:rPr/>
+    </w:lvl>
+  </w:abstractNum>
+  <w:abstractNum w:abstractNumId="6">
+    <w:lvl w:ilvl="0">
+      <w:start w:val="1"/>
+      <w:numFmt w:val="bullet"/>
+      <w:lvlText w:val=""/>
+      <w:lvlJc w:val="start"/>
+      <w:pPr>
+        <w:tabs>
+          <w:tab w:val="num" w:pos="720"/>
+        </w:tabs>
+        <w:ind w:start="720" w:hanging="360"/>
+      </w:pPr>
+      <w:rPr>
+        <w:rFonts w:ascii="Symbol" w:hAnsi="Symbol" w:cs="Symbol" w:hint="default"/>
+      </w:rPr>
+    </w:lvl>
+    <w:lvl w:ilvl="1">
+      <w:start w:val="1"/>
+      <w:numFmt w:val="bullet"/>
+      <w:lvlText w:val="◦"/>
+      <w:lvlJc w:val="start"/>
+      <w:pPr>
+        <w:tabs>
+          <w:tab w:val="num" w:pos="1080"/>
+        </w:tabs>
+        <w:ind w:start="1080" w:hanging="360"/>
+      </w:pPr>
+      <w:rPr>
+        <w:rFonts w:ascii="OpenSymbol" w:hAnsi="OpenSymbol" w:cs="OpenSymbol" w:hint="default"/>
+      </w:rPr>
+    </w:lvl>
+    <w:lvl w:ilvl="2">
+      <w:start w:val="1"/>
+      <w:numFmt w:val="bullet"/>
+      <w:lvlText w:val="▪"/>
+      <w:lvlJc w:val="start"/>
+      <w:pPr>
+        <w:tabs>
+          <w:tab w:val="num" w:pos="1440"/>
+        </w:tabs>
+        <w:ind w:start="1440" w:hanging="360"/>
+      </w:pPr>
+      <w:rPr>
+        <w:rFonts w:ascii="OpenSymbol" w:hAnsi="OpenSymbol" w:cs="OpenSymbol" w:hint="default"/>
+      </w:rPr>
+    </w:lvl>
+    <w:lvl w:ilvl="3">
+      <w:start w:val="1"/>
+      <w:numFmt w:val="bullet"/>
+      <w:lvlText w:val=""/>
+      <w:lvlJc w:val="start"/>
+      <w:pPr>
+        <w:tabs>
+          <w:tab w:val="num" w:pos="1800"/>
+        </w:tabs>
+        <w:ind w:start="1800" w:hanging="360"/>
+      </w:pPr>
+      <w:rPr>
+        <w:rFonts w:ascii="Symbol" w:hAnsi="Symbol" w:cs="Symbol" w:hint="default"/>
+      </w:rPr>
+    </w:lvl>
+    <w:lvl w:ilvl="4">
+      <w:start w:val="1"/>
+      <w:numFmt w:val="bullet"/>
+      <w:lvlText w:val="◦"/>
+      <w:lvlJc w:val="start"/>
+      <w:pPr>
+        <w:tabs>
+          <w:tab w:val="num" w:pos="2160"/>
+        </w:tabs>
+        <w:ind w:start="2160" w:hanging="360"/>
+      </w:pPr>
+      <w:rPr>
+        <w:rFonts w:ascii="OpenSymbol" w:hAnsi="OpenSymbol" w:cs="OpenSymbol" w:hint="default"/>
+      </w:rPr>
+    </w:lvl>
+    <w:lvl w:ilvl="5">
+      <w:start w:val="1"/>
+      <w:numFmt w:val="bullet"/>
+      <w:lvlText w:val="▪"/>
+      <w:lvlJc w:val="start"/>
+      <w:pPr>
+        <w:tabs>
+          <w:tab w:val="num" w:pos="2520"/>
+        </w:tabs>
+        <w:ind w:start="2520" w:hanging="360"/>
+      </w:pPr>
+      <w:rPr>
+        <w:rFonts w:ascii="OpenSymbol" w:hAnsi="OpenSymbol" w:cs="OpenSymbol" w:hint="default"/>
+      </w:rPr>
+    </w:lvl>
+    <w:lvl w:ilvl="6">
+      <w:start w:val="1"/>
+      <w:numFmt w:val="bullet"/>
+      <w:lvlText w:val=""/>
+      <w:lvlJc w:val="start"/>
+      <w:pPr>
+        <w:tabs>
+          <w:tab w:val="num" w:pos="2880"/>
+        </w:tabs>
+        <w:ind w:start="2880" w:hanging="360"/>
+      </w:pPr>
+      <w:rPr>
+        <w:rFonts w:ascii="Symbol" w:hAnsi="Symbol" w:cs="Symbol" w:hint="default"/>
+      </w:rPr>
+    </w:lvl>
+    <w:lvl w:ilvl="7">
+      <w:start w:val="1"/>
+      <w:numFmt w:val="bullet"/>
+      <w:lvlText w:val="◦"/>
+      <w:lvlJc w:val="start"/>
+      <w:pPr>
+        <w:tabs>
+          <w:tab w:val="num" w:pos="3240"/>
+        </w:tabs>
+        <w:ind w:start="3240" w:hanging="360"/>
+      </w:pPr>
+      <w:rPr>
+        <w:rFonts w:ascii="OpenSymbol" w:hAnsi="OpenSymbol" w:cs="OpenSymbol" w:hint="default"/>
+      </w:rPr>
+    </w:lvl>
+    <w:lvl w:ilvl="8">
+      <w:start w:val="1"/>
+      <w:numFmt w:val="bullet"/>
+      <w:lvlText w:val="▪"/>
+      <w:lvlJc w:val="start"/>
+      <w:pPr>
+        <w:tabs>
+          <w:tab w:val="num" w:pos="3600"/>
+        </w:tabs>
+        <w:ind w:start="3600" w:hanging="360"/>
+      </w:pPr>
+      <w:rPr>
+        <w:rFonts w:ascii="OpenSymbol" w:hAnsi="OpenSymbol" w:cs="OpenSymbol" w:hint="default"/>
+      </w:rPr>
+    </w:lvl>
+  </w:abstractNum>
+  <w:abstractNum w:abstractNumId="7">
+    <w:lvl w:ilvl="0">
+      <w:start w:val="1"/>
+      <w:numFmt w:val="bullet"/>
+      <w:lvlText w:val=""/>
+      <w:lvlJc w:val="start"/>
+      <w:pPr>
+        <w:tabs>
+          <w:tab w:val="num" w:pos="720"/>
+        </w:tabs>
+        <w:ind w:start="720" w:hanging="360"/>
+      </w:pPr>
+      <w:rPr>
+        <w:rFonts w:ascii="Symbol" w:hAnsi="Symbol" w:cs="Symbol" w:hint="default"/>
+      </w:rPr>
+    </w:lvl>
+    <w:lvl w:ilvl="1">
+      <w:start w:val="1"/>
+      <w:numFmt w:val="bullet"/>
+      <w:lvlText w:val="◦"/>
+      <w:lvlJc w:val="start"/>
+      <w:pPr>
+        <w:tabs>
+          <w:tab w:val="num" w:pos="1080"/>
+        </w:tabs>
+        <w:ind w:start="1080" w:hanging="360"/>
+      </w:pPr>
+      <w:rPr>
+        <w:rFonts w:ascii="OpenSymbol" w:hAnsi="OpenSymbol" w:cs="OpenSymbol" w:hint="default"/>
+      </w:rPr>
+    </w:lvl>
+    <w:lvl w:ilvl="2">
+      <w:start w:val="1"/>
+      <w:numFmt w:val="bullet"/>
+      <w:lvlText w:val="▪"/>
+      <w:lvlJc w:val="start"/>
+      <w:pPr>
+        <w:tabs>
+          <w:tab w:val="num" w:pos="1440"/>
+        </w:tabs>
+        <w:ind w:start="1440" w:hanging="360"/>
+      </w:pPr>
+      <w:rPr>
+        <w:rFonts w:ascii="OpenSymbol" w:hAnsi="OpenSymbol" w:cs="OpenSymbol" w:hint="default"/>
+      </w:rPr>
+    </w:lvl>
+    <w:lvl w:ilvl="3">
+      <w:start w:val="1"/>
+      <w:numFmt w:val="bullet"/>
+      <w:lvlText w:val=""/>
+      <w:lvlJc w:val="start"/>
+      <w:pPr>
+        <w:tabs>
+          <w:tab w:val="num" w:pos="1800"/>
+        </w:tabs>
+        <w:ind w:start="1800" w:hanging="360"/>
+      </w:pPr>
+      <w:rPr>
+        <w:rFonts w:ascii="Symbol" w:hAnsi="Symbol" w:cs="Symbol" w:hint="default"/>
+      </w:rPr>
+    </w:lvl>
+    <w:lvl w:ilvl="4">
+      <w:start w:val="1"/>
+      <w:numFmt w:val="bullet"/>
+      <w:lvlText w:val="◦"/>
+      <w:lvlJc w:val="start"/>
+      <w:pPr>
+        <w:tabs>
+          <w:tab w:val="num" w:pos="2160"/>
+        </w:tabs>
+        <w:ind w:start="2160" w:hanging="360"/>
+      </w:pPr>
+      <w:rPr>
+        <w:rFonts w:ascii="OpenSymbol" w:hAnsi="OpenSymbol" w:cs="OpenSymbol" w:hint="default"/>
+      </w:rPr>
+    </w:lvl>
+    <w:lvl w:ilvl="5">
+      <w:start w:val="1"/>
+      <w:numFmt w:val="bullet"/>
+      <w:lvlText w:val="▪"/>
+      <w:lvlJc w:val="start"/>
+      <w:pPr>
+        <w:tabs>
+          <w:tab w:val="num" w:pos="2520"/>
+        </w:tabs>
+        <w:ind w:start="2520" w:hanging="360"/>
+      </w:pPr>
+      <w:rPr>
+        <w:rFonts w:ascii="OpenSymbol" w:hAnsi="OpenSymbol" w:cs="OpenSymbol" w:hint="default"/>
+      </w:rPr>
+    </w:lvl>
+    <w:lvl w:ilvl="6">
+      <w:start w:val="1"/>
+      <w:numFmt w:val="bullet"/>
+      <w:lvlText w:val=""/>
+      <w:lvlJc w:val="start"/>
+      <w:pPr>
+        <w:tabs>
+          <w:tab w:val="num" w:pos="2880"/>
+        </w:tabs>
+        <w:ind w:start="2880" w:hanging="360"/>
+      </w:pPr>
+      <w:rPr>
+        <w:rFonts w:ascii="Symbol" w:hAnsi="Symbol" w:cs="Symbol" w:hint="default"/>
+      </w:rPr>
+    </w:lvl>
+    <w:lvl w:ilvl="7">
+      <w:start w:val="1"/>
+      <w:numFmt w:val="bullet"/>
+      <w:lvlText w:val="◦"/>
+      <w:lvlJc w:val="start"/>
+      <w:pPr>
+        <w:tabs>
+          <w:tab w:val="num" w:pos="3240"/>
+        </w:tabs>
+        <w:ind w:start="3240" w:hanging="360"/>
+      </w:pPr>
+      <w:rPr>
+        <w:rFonts w:ascii="OpenSymbol" w:hAnsi="OpenSymbol" w:cs="OpenSymbol" w:hint="default"/>
+      </w:rPr>
+    </w:lvl>
+    <w:lvl w:ilvl="8">
+      <w:start w:val="1"/>
+      <w:numFmt w:val="bullet"/>
+      <w:lvlText w:val="▪"/>
+      <w:lvlJc w:val="start"/>
+      <w:pPr>
+        <w:tabs>
+          <w:tab w:val="num" w:pos="3600"/>
+        </w:tabs>
+        <w:ind w:start="3600" w:hanging="360"/>
+      </w:pPr>
+      <w:rPr>
+        <w:rFonts w:ascii="OpenSymbol" w:hAnsi="OpenSymbol" w:cs="OpenSymbol" w:hint="default"/>
+      </w:rPr>
+    </w:lvl>
+  </w:abstractNum>
+  <w:abstractNum w:abstractNumId="8">
+    <w:lvl w:ilvl="0">
+      <w:start w:val="1"/>
+      <w:numFmt w:val="bullet"/>
+      <w:lvlText w:val=""/>
+      <w:lvlJc w:val="start"/>
+      <w:pPr>
+        <w:tabs>
+          <w:tab w:val="num" w:pos="720"/>
+        </w:tabs>
+        <w:ind w:start="720" w:hanging="360"/>
+      </w:pPr>
+      <w:rPr>
+        <w:rFonts w:ascii="Symbol" w:hAnsi="Symbol" w:cs="Symbol" w:hint="default"/>
+      </w:rPr>
+    </w:lvl>
+    <w:lvl w:ilvl="1">
+      <w:start w:val="1"/>
+      <w:numFmt w:val="bullet"/>
+      <w:lvlText w:val="◦"/>
+      <w:lvlJc w:val="start"/>
+      <w:pPr>
+        <w:tabs>
+          <w:tab w:val="num" w:pos="1080"/>
+        </w:tabs>
+        <w:ind w:start="1080" w:hanging="360"/>
+      </w:pPr>
+      <w:rPr>
+        <w:rFonts w:ascii="OpenSymbol" w:hAnsi="OpenSymbol" w:cs="OpenSymbol" w:hint="default"/>
+      </w:rPr>
+    </w:lvl>
+    <w:lvl w:ilvl="2">
+      <w:start w:val="1"/>
+      <w:numFmt w:val="bullet"/>
+      <w:lvlText w:val="▪"/>
+      <w:lvlJc w:val="start"/>
+      <w:pPr>
+        <w:tabs>
+          <w:tab w:val="num" w:pos="1440"/>
+        </w:tabs>
+        <w:ind w:start="1440" w:hanging="360"/>
+      </w:pPr>
+      <w:rPr>
+        <w:rFonts w:ascii="OpenSymbol" w:hAnsi="OpenSymbol" w:cs="OpenSymbol" w:hint="default"/>
+      </w:rPr>
+    </w:lvl>
+    <w:lvl w:ilvl="3">
+      <w:start w:val="1"/>
+      <w:numFmt w:val="bullet"/>
+      <w:lvlText w:val=""/>
+      <w:lvlJc w:val="start"/>
+      <w:pPr>
+        <w:tabs>
+          <w:tab w:val="num" w:pos="1800"/>
+        </w:tabs>
+        <w:ind w:start="1800" w:hanging="360"/>
+      </w:pPr>
+      <w:rPr>
+        <w:rFonts w:ascii="Symbol" w:hAnsi="Symbol" w:cs="Symbol" w:hint="default"/>
+      </w:rPr>
+    </w:lvl>
+    <w:lvl w:ilvl="4">
+      <w:start w:val="1"/>
+      <w:numFmt w:val="bullet"/>
+      <w:lvlText w:val="◦"/>
+      <w:lvlJc w:val="start"/>
+      <w:pPr>
+        <w:tabs>
+          <w:tab w:val="num" w:pos="2160"/>
+        </w:tabs>
+        <w:ind w:start="2160" w:hanging="360"/>
+      </w:pPr>
+      <w:rPr>
+        <w:rFonts w:ascii="OpenSymbol" w:hAnsi="OpenSymbol" w:cs="OpenSymbol" w:hint="default"/>
+      </w:rPr>
+    </w:lvl>
+    <w:lvl w:ilvl="5">
+      <w:start w:val="1"/>
+      <w:numFmt w:val="bullet"/>
+      <w:lvlText w:val="▪"/>
+      <w:lvlJc w:val="start"/>
+      <w:pPr>
+        <w:tabs>
+          <w:tab w:val="num" w:pos="2520"/>
+        </w:tabs>
+        <w:ind w:start="2520" w:hanging="360"/>
+      </w:pPr>
+      <w:rPr>
+        <w:rFonts w:ascii="OpenSymbol" w:hAnsi="OpenSymbol" w:cs="OpenSymbol" w:hint="default"/>
+      </w:rPr>
+    </w:lvl>
+    <w:lvl w:ilvl="6">
+      <w:start w:val="1"/>
+      <w:numFmt w:val="bullet"/>
+      <w:lvlText w:val=""/>
+      <w:lvlJc w:val="start"/>
+      <w:pPr>
+        <w:tabs>
+          <w:tab w:val="num" w:pos="2880"/>
+        </w:tabs>
+        <w:ind w:start="2880" w:hanging="360"/>
+      </w:pPr>
+      <w:rPr>
+        <w:rFonts w:ascii="Symbol" w:hAnsi="Symbol" w:cs="Symbol" w:hint="default"/>
+      </w:rPr>
+    </w:lvl>
+    <w:lvl w:ilvl="7">
+      <w:start w:val="1"/>
+      <w:numFmt w:val="bullet"/>
+      <w:lvlText w:val="◦"/>
+      <w:lvlJc w:val="start"/>
+      <w:pPr>
+        <w:tabs>
+          <w:tab w:val="num" w:pos="3240"/>
+        </w:tabs>
+        <w:ind w:start="3240" w:hanging="360"/>
+      </w:pPr>
+      <w:rPr>
+        <w:rFonts w:ascii="OpenSymbol" w:hAnsi="OpenSymbol" w:cs="OpenSymbol" w:hint="default"/>
+      </w:rPr>
+    </w:lvl>
+    <w:lvl w:ilvl="8">
+      <w:start w:val="1"/>
+      <w:numFmt w:val="bullet"/>
+      <w:lvlText w:val="▪"/>
+      <w:lvlJc w:val="start"/>
+      <w:pPr>
+        <w:tabs>
+          <w:tab w:val="num" w:pos="3600"/>
+        </w:tabs>
+        <w:ind w:start="3600" w:hanging="360"/>
+      </w:pPr>
+      <w:rPr>
+        <w:rFonts w:ascii="OpenSymbol" w:hAnsi="OpenSymbol" w:cs="OpenSymbol" w:hint="default"/>
+      </w:rPr>
+    </w:lvl>
+  </w:abstractNum>
+  <w:abstractNum w:abstractNumId="9">
+    <w:lvl w:ilvl="0">
+      <w:start w:val="1"/>
+      <w:numFmt w:val="bullet"/>
+      <w:lvlText w:val=""/>
+      <w:lvlJc w:val="start"/>
+      <w:pPr>
+        <w:tabs>
+          <w:tab w:val="num" w:pos="720"/>
+        </w:tabs>
+        <w:ind w:start="720" w:hanging="360"/>
+      </w:pPr>
+      <w:rPr>
+        <w:rFonts w:ascii="Symbol" w:hAnsi="Symbol" w:cs="Symbol" w:hint="default"/>
+      </w:rPr>
+    </w:lvl>
+    <w:lvl w:ilvl="1">
+      <w:start w:val="1"/>
+      <w:numFmt w:val="bullet"/>
+      <w:lvlText w:val="◦"/>
+      <w:lvlJc w:val="start"/>
+      <w:pPr>
+        <w:tabs>
+          <w:tab w:val="num" w:pos="1080"/>
+        </w:tabs>
+        <w:ind w:start="1080" w:hanging="360"/>
+      </w:pPr>
+      <w:rPr>
+        <w:rFonts w:ascii="OpenSymbol" w:hAnsi="OpenSymbol" w:cs="OpenSymbol" w:hint="default"/>
+      </w:rPr>
+    </w:lvl>
+    <w:lvl w:ilvl="2">
+      <w:start w:val="1"/>
+      <w:numFmt w:val="bullet"/>
+      <w:lvlText w:val="▪"/>
+      <w:lvlJc w:val="start"/>
+      <w:pPr>
+        <w:tabs>
+          <w:tab w:val="num" w:pos="1440"/>
+        </w:tabs>
+        <w:ind w:start="1440" w:hanging="360"/>
+      </w:pPr>
+      <w:rPr>
+        <w:rFonts w:ascii="OpenSymbol" w:hAnsi="OpenSymbol" w:cs="OpenSymbol" w:hint="default"/>
+      </w:rPr>
+    </w:lvl>
+    <w:lvl w:ilvl="3">
+      <w:start w:val="1"/>
+      <w:numFmt w:val="bullet"/>
+      <w:lvlText w:val=""/>
+      <w:lvlJc w:val="start"/>
+      <w:pPr>
+        <w:tabs>
+          <w:tab w:val="num" w:pos="1800"/>
+        </w:tabs>
+        <w:ind w:start="1800" w:hanging="360"/>
+      </w:pPr>
+      <w:rPr>
+        <w:rFonts w:ascii="Symbol" w:hAnsi="Symbol" w:cs="Symbol" w:hint="default"/>
+      </w:rPr>
+    </w:lvl>
+    <w:lvl w:ilvl="4">
+      <w:start w:val="1"/>
+      <w:numFmt w:val="bullet"/>
+      <w:lvlText w:val="◦"/>
+      <w:lvlJc w:val="start"/>
+      <w:pPr>
+        <w:tabs>
+          <w:tab w:val="num" w:pos="2160"/>
+        </w:tabs>
+        <w:ind w:start="2160" w:hanging="360"/>
+      </w:pPr>
+      <w:rPr>
+        <w:rFonts w:ascii="OpenSymbol" w:hAnsi="OpenSymbol" w:cs="OpenSymbol" w:hint="default"/>
+      </w:rPr>
+    </w:lvl>
+    <w:lvl w:ilvl="5">
+      <w:start w:val="1"/>
+      <w:numFmt w:val="bullet"/>
+      <w:lvlText w:val="▪"/>
+      <w:lvlJc w:val="start"/>
+      <w:pPr>
+        <w:tabs>
+          <w:tab w:val="num" w:pos="2520"/>
+        </w:tabs>
+        <w:ind w:start="2520" w:hanging="360"/>
+      </w:pPr>
+      <w:rPr>
+        <w:rFonts w:ascii="OpenSymbol" w:hAnsi="OpenSymbol" w:cs="OpenSymbol" w:hint="default"/>
+      </w:rPr>
+    </w:lvl>
+    <w:lvl w:ilvl="6">
+      <w:start w:val="1"/>
+      <w:numFmt w:val="bullet"/>
+      <w:lvlText w:val=""/>
+      <w:lvlJc w:val="start"/>
+      <w:pPr>
+        <w:tabs>
+          <w:tab w:val="num" w:pos="2880"/>
+        </w:tabs>
+        <w:ind w:start="2880" w:hanging="360"/>
+      </w:pPr>
+      <w:rPr>
+        <w:rFonts w:ascii="Symbol" w:hAnsi="Symbol" w:cs="Symbol" w:hint="default"/>
+      </w:rPr>
+    </w:lvl>
+    <w:lvl w:ilvl="7">
+      <w:start w:val="1"/>
+      <w:numFmt w:val="bullet"/>
+      <w:lvlText w:val="◦"/>
+      <w:lvlJc w:val="start"/>
+      <w:pPr>
+        <w:tabs>
+          <w:tab w:val="num" w:pos="3240"/>
+        </w:tabs>
+        <w:ind w:start="3240" w:hanging="360"/>
+      </w:pPr>
+      <w:rPr>
+        <w:rFonts w:ascii="OpenSymbol" w:hAnsi="OpenSymbol" w:cs="OpenSymbol" w:hint="default"/>
+      </w:rPr>
+    </w:lvl>
+    <w:lvl w:ilvl="8">
+      <w:start w:val="1"/>
+      <w:numFmt w:val="bullet"/>
+      <w:lvlText w:val="▪"/>
+      <w:lvlJc w:val="start"/>
+      <w:pPr>
+        <w:tabs>
+          <w:tab w:val="num" w:pos="3600"/>
+        </w:tabs>
+        <w:ind w:start="3600" w:hanging="360"/>
+      </w:pPr>
+      <w:rPr>
+        <w:rFonts w:ascii="OpenSymbol" w:hAnsi="OpenSymbol" w:cs="OpenSymbol" w:hint="default"/>
+      </w:rPr>
+    </w:lvl>
+  </w:abstractNum>
+  <w:abstractNum w:abstractNumId="10">
+    <w:lvl w:ilvl="0">
+      <w:start w:val="1"/>
       <w:numFmt w:val="none"/>
       <w:suff w:val="nothing"/>
       <w:lvlText w:val=""/>
@@ -1046,6 +2252,24 @@
   <w:num w:numId="4">
     <w:abstractNumId w:val="4"/>
   </w:num>
+  <w:num w:numId="5">
+    <w:abstractNumId w:val="5"/>
+  </w:num>
+  <w:num w:numId="6">
+    <w:abstractNumId w:val="6"/>
+  </w:num>
+  <w:num w:numId="7">
+    <w:abstractNumId w:val="7"/>
+  </w:num>
+  <w:num w:numId="8">
+    <w:abstractNumId w:val="8"/>
+  </w:num>
+  <w:num w:numId="9">
+    <w:abstractNumId w:val="9"/>
+  </w:num>
+  <w:num w:numId="10">
+    <w:abstractNumId w:val="10"/>
+  </w:num>
 </w:numbering>
 </file>
 
@@ -1073,7 +2297,7 @@
     <w:pPr>
       <w:widowControl/>
       <w:suppressAutoHyphens w:val="true"/>
-      <w:overflowPunct w:val="false"/>
+      <w:overflowPunct w:val="true"/>
       <w:bidi w:val="0"/>
       <w:spacing w:before="0" w:after="0"/>
       <w:jc w:val="start"/>
@@ -1172,8 +2396,8 @@
       <w:szCs w:val="30"/>
     </w:rPr>
   </w:style>
-  <w:style w:type="character" w:styleId="Bullets">
-    <w:name w:val="Bullets"/>
+  <w:style w:type="character" w:styleId="Bulletsuser">
+    <w:name w:val="Bullets (user)"/>
     <w:qFormat/>
     <w:rPr>
       <w:rFonts w:ascii="OpenSymbol" w:hAnsi="OpenSymbol" w:eastAsia="OpenSymbol" w:cs="OpenSymbol"/>
@@ -1183,6 +2407,13 @@
     <w:name w:val="Numbering Symbols"/>
     <w:qFormat/>
     <w:rPr/>
+  </w:style>
+  <w:style w:type="character" w:styleId="Bullets">
+    <w:name w:val="Bullets"/>
+    <w:qFormat/>
+    <w:rPr>
+      <w:rFonts w:ascii="OpenSymbol" w:hAnsi="OpenSymbol" w:eastAsia="OpenSymbol" w:cs="OpenSymbol"/>
+    </w:rPr>
   </w:style>
   <w:style w:type="paragraph" w:styleId="Heading">
     <w:name w:val="Heading"/>

</xml_diff>